<commit_message>
Update billing records and SEO client logs
</commit_message>
<xml_diff>
--- a/SEO-Clients-Hub/clients/CFB/CFB-On-Page-SEO-Audit-Running-Log.docx
+++ b/SEO-Clients-Hub/clients/CFB/CFB-On-Page-SEO-Audit-Running-Log.docx
@@ -66,7 +66,7 @@
           <w:sz w:val="22"/>
           <w:szCs w:val="22"/>
         </w:rPr>
-        <w:t xml:space="preserve">Last updated: 2026-09-11   •   Pages audited: 32 of 52   •   Verified live: 30   •   Needs attention: 2</w:t>
+        <w:t xml:space="preserve">Last updated: 2026-09-11   •   Pages audited: 34 of 52   •   Verified live: 33   •   Needs attention: 2</w:t>
       </w:r>
     </w:p>
     <w:p>
@@ -10838,11 +10838,11 @@
           <w:rFonts w:ascii="Arial" w:cs="Arial" w:eastAsia="Arial" w:hAnsi="Arial"/>
           <w:b/>
           <w:bCs/>
-          <w:color w:val="B26B00"/>
-          <w:sz w:val="20"/>
-          <w:szCs w:val="20"/>
-        </w:rPr>
-        <w:t xml:space="preserve">IMPLEMENTED in HubSpot 2026-09-11 — live verification pending (cache)</w:t>
+          <w:color w:val="2E7D32"/>
+          <w:sz w:val="20"/>
+          <w:szCs w:val="20"/>
+        </w:rPr>
+        <w:t xml:space="preserve">VERIFIED LIVE 2026-09-14 (title, meta, 7 image alts, Service schema)</w:t>
       </w:r>
     </w:p>
     <w:p>
@@ -35596,6 +35596,1381 @@
           <w:szCs w:val="16"/>
         </w:rPr>
         <w:t xml:space="preserve">  "category": "Cleanroom Packaging Materials"</w:t>
+      </w:r>
+    </w:p>
+    <w:p>
+      <w:pPr>
+        <w:shd w:fill="F5F5F5" w:val="clear"/>
+        <w:spacing w:after="0"/>
+        <w:ind w:left="360"/>
+      </w:pPr>
+      <w:r>
+        <w:rPr>
+          <w:rFonts w:ascii="Courier New" w:cs="Courier New" w:eastAsia="Courier New" w:hAnsi="Courier New"/>
+          <w:sz w:val="16"/>
+          <w:szCs w:val="16"/>
+        </w:rPr>
+        <w:t xml:space="preserve">}</w:t>
+      </w:r>
+    </w:p>
+    <w:p>
+      <w:pPr>
+        <w:shd w:fill="F5F5F5" w:val="clear"/>
+        <w:spacing w:after="0"/>
+        <w:ind w:left="360"/>
+      </w:pPr>
+      <w:r>
+        <w:rPr>
+          <w:rFonts w:ascii="Courier New" w:cs="Courier New" w:eastAsia="Courier New" w:hAnsi="Courier New"/>
+          <w:sz w:val="16"/>
+          <w:szCs w:val="16"/>
+        </w:rPr>
+        <w:t xml:space="preserve">&lt;/script&gt;</w:t>
+      </w:r>
+    </w:p>
+    <w:p>
+      <w:pPr>
+        <w:spacing w:after="160"/>
+      </w:pPr>
+    </w:p>
+    <w:p>
+      <w:pPr>
+        <w:pStyle w:val="Heading1"/>
+        <w:spacing w:after="160" w:before="400"/>
+      </w:pPr>
+      <w:r>
+        <w:rPr>
+          <w:rFonts w:ascii="Arial" w:cs="Arial" w:eastAsia="Arial" w:hAnsi="Arial"/>
+          <w:b/>
+          <w:bCs/>
+          <w:color w:val="003366"/>
+          <w:sz w:val="30"/>
+          <w:szCs w:val="30"/>
+        </w:rPr>
+        <w:t xml:space="preserve">Standards</w:t>
+      </w:r>
+    </w:p>
+    <w:p>
+      <w:pPr>
+        <w:spacing w:after="120"/>
+      </w:pPr>
+      <w:r>
+        <w:rPr>
+          <w:rFonts w:ascii="Arial" w:cs="Arial" w:eastAsia="Arial" w:hAnsi="Arial"/>
+          <w:b/>
+          <w:bCs/>
+          <w:color w:val="2E7D32"/>
+          <w:sz w:val="20"/>
+          <w:szCs w:val="20"/>
+        </w:rPr>
+        <w:t xml:space="preserve">VERIFIED LIVE 2026-09-18 (title, meta, chart image alt, WebPage schema)</w:t>
+      </w:r>
+    </w:p>
+    <w:p>
+      <w:pPr>
+        <w:spacing w:after="120"/>
+      </w:pPr>
+      <w:r>
+        <w:rPr>
+          <w:rFonts w:ascii="Arial" w:cs="Arial" w:eastAsia="Arial" w:hAnsi="Arial"/>
+          <w:b/>
+          <w:bCs/>
+          <w:sz w:val="20"/>
+          <w:szCs w:val="20"/>
+        </w:rPr>
+        <w:t xml:space="preserve">Live URL: </w:t>
+      </w:r>
+      <w:r>
+        <w:rPr>
+          <w:rFonts w:ascii="Arial" w:cs="Arial" w:eastAsia="Arial" w:hAnsi="Arial"/>
+          <w:color w:val="0563C1"/>
+          <w:sz w:val="20"/>
+          <w:szCs w:val="20"/>
+        </w:rPr>
+        <w:t xml:space="preserve">https://www.cleanroomfilm.com/standards</w:t>
+      </w:r>
+    </w:p>
+    <w:p>
+      <w:pPr>
+        <w:spacing w:after="120"/>
+      </w:pPr>
+      <w:r>
+        <w:rPr>
+          <w:rFonts w:ascii="Arial" w:cs="Arial" w:eastAsia="Arial" w:hAnsi="Arial"/>
+          <w:b/>
+          <w:bCs/>
+          <w:sz w:val="20"/>
+          <w:szCs w:val="20"/>
+        </w:rPr>
+        <w:t xml:space="preserve">HubSpot editor: </w:t>
+      </w:r>
+      <w:r>
+        <w:rPr>
+          <w:rFonts w:ascii="Arial" w:cs="Arial" w:eastAsia="Arial" w:hAnsi="Arial"/>
+          <w:color w:val="0563C1"/>
+          <w:sz w:val="20"/>
+          <w:szCs w:val="20"/>
+        </w:rPr>
+        <w:t xml:space="preserve">https://app.hubspot.com/pages/24024882/editor/ (add page ID from HubSpot)</w:t>
+      </w:r>
+    </w:p>
+    <w:p>
+      <w:pPr>
+        <w:spacing w:after="120"/>
+      </w:pPr>
+      <w:r>
+        <w:rPr>
+          <w:rFonts w:ascii="Arial" w:cs="Arial" w:eastAsia="Arial" w:hAnsi="Arial"/>
+          <w:b/>
+          <w:bCs/>
+          <w:sz w:val="20"/>
+          <w:szCs w:val="20"/>
+        </w:rPr>
+        <w:t xml:space="preserve">Audited: </w:t>
+      </w:r>
+      <w:r>
+        <w:rPr>
+          <w:rFonts w:ascii="Arial" w:cs="Arial" w:eastAsia="Arial" w:hAnsi="Arial"/>
+          <w:sz w:val="20"/>
+          <w:szCs w:val="20"/>
+        </w:rPr>
+        <w:t xml:space="preserve">2026-09-14      </w:t>
+      </w:r>
+      <w:r>
+        <w:rPr>
+          <w:rFonts w:ascii="Arial" w:cs="Arial" w:eastAsia="Arial" w:hAnsi="Arial"/>
+          <w:b/>
+          <w:bCs/>
+          <w:sz w:val="20"/>
+          <w:szCs w:val="20"/>
+        </w:rPr>
+        <w:t xml:space="preserve">Primary keyword: </w:t>
+      </w:r>
+      <w:r>
+        <w:rPr>
+          <w:rFonts w:ascii="Arial" w:cs="Arial" w:eastAsia="Arial" w:hAnsi="Arial"/>
+          <w:sz w:val="20"/>
+          <w:szCs w:val="20"/>
+        </w:rPr>
+        <w:t xml:space="preserve">cleanroom packaging standards</w:t>
+      </w:r>
+    </w:p>
+    <w:p>
+      <w:pPr>
+        <w:spacing w:after="120"/>
+      </w:pPr>
+      <w:r>
+        <w:rPr>
+          <w:rFonts w:ascii="Arial" w:cs="Arial" w:eastAsia="Arial" w:hAnsi="Arial"/>
+          <w:b/>
+          <w:bCs/>
+          <w:sz w:val="20"/>
+          <w:szCs w:val="20"/>
+        </w:rPr>
+        <w:t xml:space="preserve">Secondary keywords: </w:t>
+      </w:r>
+      <w:r>
+        <w:rPr>
+          <w:rFonts w:ascii="Arial" w:cs="Arial" w:eastAsia="Arial" w:hAnsi="Arial"/>
+          <w:sz w:val="20"/>
+          <w:szCs w:val="20"/>
+        </w:rPr>
+        <w:t xml:space="preserve">ASTM cleanroom packaging, MIL-SPEC cleanroom bags, ISO cleanroom packaging, USP packaging standards, IEST cleanroom standards</w:t>
+      </w:r>
+    </w:p>
+    <w:p>
+      <w:pPr>
+        <w:spacing w:after="120"/>
+      </w:pPr>
+      <w:r>
+        <w:rPr>
+          <w:rFonts w:ascii="Arial" w:cs="Arial" w:eastAsia="Arial" w:hAnsi="Arial"/>
+          <w:b/>
+          <w:bCs/>
+          <w:sz w:val="20"/>
+          <w:szCs w:val="20"/>
+        </w:rPr>
+        <w:t xml:space="preserve">Recommended Page Title (51 chars)</w:t>
+      </w:r>
+      <w:r>
+        <w:rPr>
+          <w:rFonts w:ascii="Arial" w:cs="Arial" w:eastAsia="Arial" w:hAnsi="Arial"/>
+          <w:sz w:val="20"/>
+          <w:szCs w:val="20"/>
+        </w:rPr>
+        <w:t xml:space="preserve"/>
+      </w:r>
+    </w:p>
+    <w:p>
+      <w:pPr>
+        <w:spacing w:after="120"/>
+      </w:pPr>
+      <w:r>
+        <w:rPr>
+          <w:rFonts w:ascii="Arial" w:cs="Arial" w:eastAsia="Arial" w:hAnsi="Arial"/>
+          <w:b/>
+          <w:bCs/>
+          <w:color w:val="003366"/>
+          <w:sz w:val="22"/>
+          <w:szCs w:val="22"/>
+        </w:rPr>
+        <w:t xml:space="preserve">Cleanroom Packaging Standards &amp; Certifications | CFB</w:t>
+      </w:r>
+    </w:p>
+    <w:p>
+      <w:pPr>
+        <w:spacing w:after="120"/>
+      </w:pPr>
+      <w:r>
+        <w:rPr>
+          <w:rFonts w:ascii="Arial" w:cs="Arial" w:eastAsia="Arial" w:hAnsi="Arial"/>
+          <w:b/>
+          <w:bCs/>
+          <w:sz w:val="20"/>
+          <w:szCs w:val="20"/>
+        </w:rPr>
+        <w:t xml:space="preserve">Recommended Meta Description (151 chars)</w:t>
+      </w:r>
+      <w:r>
+        <w:rPr>
+          <w:rFonts w:ascii="Arial" w:cs="Arial" w:eastAsia="Arial" w:hAnsi="Arial"/>
+          <w:sz w:val="20"/>
+          <w:szCs w:val="20"/>
+        </w:rPr>
+        <w:t xml:space="preserve"/>
+      </w:r>
+    </w:p>
+    <w:p>
+      <w:pPr>
+        <w:spacing w:after="120"/>
+      </w:pPr>
+      <w:r>
+        <w:rPr>
+          <w:rFonts w:ascii="Arial" w:cs="Arial" w:eastAsia="Arial" w:hAnsi="Arial"/>
+          <w:color w:val="333333"/>
+          <w:sz w:val="22"/>
+          <w:szCs w:val="22"/>
+        </w:rPr>
+        <w:t xml:space="preserve">CFB cleanroom packaging meets ASTM, MIL-SPEC, USP &amp; ISO standards — ISO-certified Class 100 facility for medical, aerospace &amp; semiconductor compliance.</w:t>
+      </w:r>
+    </w:p>
+    <w:p>
+      <w:pPr>
+        <w:spacing w:after="120"/>
+      </w:pPr>
+      <w:r>
+        <w:rPr>
+          <w:rFonts w:ascii="Arial" w:cs="Arial" w:eastAsia="Arial" w:hAnsi="Arial"/>
+          <w:b/>
+          <w:bCs/>
+          <w:sz w:val="20"/>
+          <w:szCs w:val="20"/>
+        </w:rPr>
+        <w:t xml:space="preserve">Notes: </w:t>
+      </w:r>
+      <w:r>
+        <w:rPr>
+          <w:rFonts w:ascii="Arial" w:cs="Arial" w:eastAsia="Arial" w:hAnsi="Arial"/>
+          <w:sz w:val="20"/>
+          <w:szCs w:val="20"/>
+        </w:rPr>
+        <w:t xml:space="preserve">Title had wrong brand suffix ("Cleanroom Film &amp; Bags" instead of "CFB"). Meta started with "Our ISO-certified..." — vague, no standards keywords. H1 "Standards" is bare but left as-is. The chart.avif image had a 271-char alt listing every standard verbatim — replaced with a concise 120-char descriptive alt. WebPage schema added.</w:t>
+      </w:r>
+    </w:p>
+    <w:p>
+      <w:pPr>
+        <w:spacing w:after="120"/>
+      </w:pPr>
+      <w:r>
+        <w:rPr>
+          <w:rFonts w:ascii="Arial" w:cs="Arial" w:eastAsia="Arial" w:hAnsi="Arial"/>
+          <w:b/>
+          <w:bCs/>
+          <w:sz w:val="20"/>
+          <w:szCs w:val="20"/>
+        </w:rPr>
+        <w:t xml:space="preserve">Image + Alt Text Audit (page-specific content images)</w:t>
+      </w:r>
+    </w:p>
+    <w:tbl>
+      <w:tblPr>
+        <w:tblW w:type="dxa" w:w="9800"/>
+        <w:tblBorders>
+          <w:top w:val="single" w:color="auto" w:sz="4"/>
+          <w:left w:val="single" w:color="auto" w:sz="4"/>
+          <w:bottom w:val="single" w:color="auto" w:sz="4"/>
+          <w:right w:val="single" w:color="auto" w:sz="4"/>
+          <w:insideH w:val="single" w:color="auto" w:sz="4"/>
+          <w:insideV w:val="single" w:color="auto" w:sz="4"/>
+        </w:tblBorders>
+      </w:tblPr>
+      <w:tblGrid>
+        <w:gridCol w:w="2300"/>
+        <w:gridCol w:w="1700"/>
+        <w:gridCol w:w="2600"/>
+        <w:gridCol w:w="600"/>
+        <w:gridCol w:w="2600"/>
+      </w:tblGrid>
+      <w:tr>
+        <w:trPr>
+          <w:tblHeader/>
+        </w:trPr>
+        <w:tc>
+          <w:tcPr>
+            <w:tcW w:type="dxa" w:w="2300"/>
+            <w:tcBorders>
+              <w:top w:val="single" w:color="CCCCCC" w:sz="4"/>
+              <w:left w:val="single" w:color="CCCCCC" w:sz="4"/>
+              <w:bottom w:val="single" w:color="CCCCCC" w:sz="4"/>
+              <w:right w:val="single" w:color="CCCCCC" w:sz="4"/>
+            </w:tcBorders>
+            <w:shd w:fill="D9E0E8" w:val="clear"/>
+            <w:tcMar>
+              <w:top w:type="dxa" w:w="80"/>
+              <w:left w:type="dxa" w:w="120"/>
+              <w:bottom w:type="dxa" w:w="80"/>
+              <w:right w:type="dxa" w:w="120"/>
+            </w:tcMar>
+          </w:tcPr>
+          <w:p>
+            <w:r>
+              <w:rPr>
+                <w:rFonts w:ascii="Arial" w:cs="Arial" w:eastAsia="Arial" w:hAnsi="Arial"/>
+                <w:b/>
+                <w:bCs/>
+                <w:color w:val="003366"/>
+                <w:sz w:val="20"/>
+                <w:szCs w:val="20"/>
+              </w:rPr>
+              <w:t xml:space="preserve">Image &amp; Context</w:t>
+            </w:r>
+          </w:p>
+        </w:tc>
+        <w:tc>
+          <w:tcPr>
+            <w:tcW w:type="dxa" w:w="1700"/>
+            <w:tcBorders>
+              <w:top w:val="single" w:color="CCCCCC" w:sz="4"/>
+              <w:left w:val="single" w:color="CCCCCC" w:sz="4"/>
+              <w:bottom w:val="single" w:color="CCCCCC" w:sz="4"/>
+              <w:right w:val="single" w:color="CCCCCC" w:sz="4"/>
+            </w:tcBorders>
+            <w:shd w:fill="D9E0E8" w:val="clear"/>
+            <w:tcMar>
+              <w:top w:type="dxa" w:w="80"/>
+              <w:left w:type="dxa" w:w="120"/>
+              <w:bottom w:type="dxa" w:w="80"/>
+              <w:right w:type="dxa" w:w="120"/>
+            </w:tcMar>
+          </w:tcPr>
+          <w:p>
+            <w:r>
+              <w:rPr>
+                <w:rFonts w:ascii="Arial" w:cs="Arial" w:eastAsia="Arial" w:hAnsi="Arial"/>
+                <w:b/>
+                <w:bCs/>
+                <w:color w:val="003366"/>
+                <w:sz w:val="20"/>
+                <w:szCs w:val="20"/>
+              </w:rPr>
+              <w:t xml:space="preserve">Current Alt</w:t>
+            </w:r>
+          </w:p>
+        </w:tc>
+        <w:tc>
+          <w:tcPr>
+            <w:tcW w:type="dxa" w:w="2600"/>
+            <w:tcBorders>
+              <w:top w:val="single" w:color="CCCCCC" w:sz="4"/>
+              <w:left w:val="single" w:color="CCCCCC" w:sz="4"/>
+              <w:bottom w:val="single" w:color="CCCCCC" w:sz="4"/>
+              <w:right w:val="single" w:color="CCCCCC" w:sz="4"/>
+            </w:tcBorders>
+            <w:shd w:fill="D9E0E8" w:val="clear"/>
+            <w:tcMar>
+              <w:top w:type="dxa" w:w="80"/>
+              <w:left w:type="dxa" w:w="120"/>
+              <w:bottom w:type="dxa" w:w="80"/>
+              <w:right w:type="dxa" w:w="120"/>
+            </w:tcMar>
+          </w:tcPr>
+          <w:p>
+            <w:r>
+              <w:rPr>
+                <w:rFonts w:ascii="Arial" w:cs="Arial" w:eastAsia="Arial" w:hAnsi="Arial"/>
+                <w:b/>
+                <w:bCs/>
+                <w:color w:val="003366"/>
+                <w:sz w:val="20"/>
+                <w:szCs w:val="20"/>
+              </w:rPr>
+              <w:t xml:space="preserve">Suggested Alt Text</w:t>
+            </w:r>
+          </w:p>
+        </w:tc>
+        <w:tc>
+          <w:tcPr>
+            <w:tcW w:type="dxa" w:w="600"/>
+            <w:tcBorders>
+              <w:top w:val="single" w:color="CCCCCC" w:sz="4"/>
+              <w:left w:val="single" w:color="CCCCCC" w:sz="4"/>
+              <w:bottom w:val="single" w:color="CCCCCC" w:sz="4"/>
+              <w:right w:val="single" w:color="CCCCCC" w:sz="4"/>
+            </w:tcBorders>
+            <w:shd w:fill="D9E0E8" w:val="clear"/>
+            <w:tcMar>
+              <w:top w:type="dxa" w:w="80"/>
+              <w:left w:type="dxa" w:w="120"/>
+              <w:bottom w:type="dxa" w:w="80"/>
+              <w:right w:type="dxa" w:w="120"/>
+            </w:tcMar>
+          </w:tcPr>
+          <w:p>
+            <w:r>
+              <w:rPr>
+                <w:rFonts w:ascii="Arial" w:cs="Arial" w:eastAsia="Arial" w:hAnsi="Arial"/>
+                <w:b/>
+                <w:bCs/>
+                <w:color w:val="003366"/>
+                <w:sz w:val="20"/>
+                <w:szCs w:val="20"/>
+              </w:rPr>
+              <w:t xml:space="preserve">Chars</w:t>
+            </w:r>
+          </w:p>
+        </w:tc>
+        <w:tc>
+          <w:tcPr>
+            <w:tcW w:type="dxa" w:w="2600"/>
+            <w:tcBorders>
+              <w:top w:val="single" w:color="CCCCCC" w:sz="4"/>
+              <w:left w:val="single" w:color="CCCCCC" w:sz="4"/>
+              <w:bottom w:val="single" w:color="CCCCCC" w:sz="4"/>
+              <w:right w:val="single" w:color="CCCCCC" w:sz="4"/>
+            </w:tcBorders>
+            <w:shd w:fill="D9E0E8" w:val="clear"/>
+            <w:tcMar>
+              <w:top w:type="dxa" w:w="80"/>
+              <w:left w:type="dxa" w:w="120"/>
+              <w:bottom w:type="dxa" w:w="80"/>
+              <w:right w:type="dxa" w:w="120"/>
+            </w:tcMar>
+          </w:tcPr>
+          <w:p>
+            <w:r>
+              <w:rPr>
+                <w:rFonts w:ascii="Arial" w:cs="Arial" w:eastAsia="Arial" w:hAnsi="Arial"/>
+                <w:b/>
+                <w:bCs/>
+                <w:color w:val="003366"/>
+                <w:sz w:val="20"/>
+                <w:szCs w:val="20"/>
+              </w:rPr>
+              <w:t xml:space="preserve">Rationale &amp; SEO Benefit</w:t>
+            </w:r>
+          </w:p>
+        </w:tc>
+      </w:tr>
+      <w:tr>
+        <w:tc>
+          <w:tcPr>
+            <w:tcW w:type="dxa" w:w="2300"/>
+            <w:tcBorders>
+              <w:top w:val="single" w:color="CCCCCC" w:sz="4"/>
+              <w:left w:val="single" w:color="CCCCCC" w:sz="4"/>
+              <w:bottom w:val="single" w:color="CCCCCC" w:sz="4"/>
+              <w:right w:val="single" w:color="CCCCCC" w:sz="4"/>
+            </w:tcBorders>
+            <w:tcMar>
+              <w:top w:type="dxa" w:w="80"/>
+              <w:left w:type="dxa" w:w="120"/>
+              <w:bottom w:type="dxa" w:w="80"/>
+              <w:right w:type="dxa" w:w="120"/>
+            </w:tcMar>
+          </w:tcPr>
+          <w:p>
+            <w:r>
+              <w:rPr>
+                <w:rFonts w:ascii="Arial" w:cs="Arial" w:eastAsia="Arial" w:hAnsi="Arial"/>
+                <w:sz w:val="20"/>
+                <w:szCs w:val="20"/>
+              </w:rPr>
+              <w:t xml:space="preserve">Standards chart (chart.avif)</w:t>
+            </w:r>
+          </w:p>
+        </w:tc>
+        <w:tc>
+          <w:tcPr>
+            <w:tcW w:type="dxa" w:w="1700"/>
+            <w:tcBorders>
+              <w:top w:val="single" w:color="CCCCCC" w:sz="4"/>
+              <w:left w:val="single" w:color="CCCCCC" w:sz="4"/>
+              <w:bottom w:val="single" w:color="CCCCCC" w:sz="4"/>
+              <w:right w:val="single" w:color="CCCCCC" w:sz="4"/>
+            </w:tcBorders>
+            <w:tcMar>
+              <w:top w:type="dxa" w:w="80"/>
+              <w:left w:type="dxa" w:w="120"/>
+              <w:bottom w:type="dxa" w:w="80"/>
+              <w:right w:type="dxa" w:w="120"/>
+            </w:tcMar>
+          </w:tcPr>
+          <w:p>
+            <w:r>
+              <w:rPr>
+                <w:rFonts w:ascii="Arial" w:cs="Arial" w:eastAsia="Arial" w:hAnsi="Arial"/>
+                <w:sz w:val="20"/>
+                <w:szCs w:val="20"/>
+              </w:rPr>
+              <w:t xml:space="preserve">⚠️ 271-char paragraph</w:t>
+            </w:r>
+          </w:p>
+        </w:tc>
+        <w:tc>
+          <w:tcPr>
+            <w:tcW w:type="dxa" w:w="2600"/>
+            <w:tcBorders>
+              <w:top w:val="single" w:color="CCCCCC" w:sz="4"/>
+              <w:left w:val="single" w:color="CCCCCC" w:sz="4"/>
+              <w:bottom w:val="single" w:color="CCCCCC" w:sz="4"/>
+              <w:right w:val="single" w:color="CCCCCC" w:sz="4"/>
+            </w:tcBorders>
+            <w:tcMar>
+              <w:top w:type="dxa" w:w="80"/>
+              <w:left w:type="dxa" w:w="120"/>
+              <w:bottom w:type="dxa" w:w="80"/>
+              <w:right w:type="dxa" w:w="120"/>
+            </w:tcMar>
+          </w:tcPr>
+          <w:p>
+            <w:r>
+              <w:rPr>
+                <w:rFonts w:ascii="Arial" w:cs="Arial" w:eastAsia="Arial" w:hAnsi="Arial"/>
+                <w:sz w:val="20"/>
+                <w:szCs w:val="20"/>
+              </w:rPr>
+              <w:t xml:space="preserve">Industry standards and specifications for cleanroom packaging: ASTM, MIL-SPEC, USP, IEST-STD, ANSI/ESD and ISO standards</w:t>
+            </w:r>
+          </w:p>
+        </w:tc>
+        <w:tc>
+          <w:tcPr>
+            <w:tcW w:type="dxa" w:w="600"/>
+            <w:tcBorders>
+              <w:top w:val="single" w:color="CCCCCC" w:sz="4"/>
+              <w:left w:val="single" w:color="CCCCCC" w:sz="4"/>
+              <w:bottom w:val="single" w:color="CCCCCC" w:sz="4"/>
+              <w:right w:val="single" w:color="CCCCCC" w:sz="4"/>
+            </w:tcBorders>
+            <w:tcMar>
+              <w:top w:type="dxa" w:w="80"/>
+              <w:left w:type="dxa" w:w="120"/>
+              <w:bottom w:type="dxa" w:w="80"/>
+              <w:right w:type="dxa" w:w="120"/>
+            </w:tcMar>
+          </w:tcPr>
+          <w:p>
+            <w:r>
+              <w:rPr>
+                <w:rFonts w:ascii="Arial" w:cs="Arial" w:eastAsia="Arial" w:hAnsi="Arial"/>
+                <w:sz w:val="20"/>
+                <w:szCs w:val="20"/>
+              </w:rPr>
+              <w:t xml:space="preserve">120</w:t>
+            </w:r>
+          </w:p>
+        </w:tc>
+        <w:tc>
+          <w:tcPr>
+            <w:tcW w:type="dxa" w:w="2600"/>
+            <w:tcBorders>
+              <w:top w:val="single" w:color="CCCCCC" w:sz="4"/>
+              <w:left w:val="single" w:color="CCCCCC" w:sz="4"/>
+              <w:bottom w:val="single" w:color="CCCCCC" w:sz="4"/>
+              <w:right w:val="single" w:color="CCCCCC" w:sz="4"/>
+            </w:tcBorders>
+            <w:tcMar>
+              <w:top w:type="dxa" w:w="80"/>
+              <w:left w:type="dxa" w:w="120"/>
+              <w:bottom w:type="dxa" w:w="80"/>
+              <w:right w:type="dxa" w:w="120"/>
+            </w:tcMar>
+          </w:tcPr>
+          <w:p>
+            <w:r>
+              <w:rPr>
+                <w:rFonts w:ascii="Arial" w:cs="Arial" w:eastAsia="Arial" w:hAnsi="Arial"/>
+                <w:sz w:val="20"/>
+                <w:szCs w:val="20"/>
+              </w:rPr>
+              <w:t xml:space="preserve">Alt was a verbatim dump of the table contents. Replaced with concise descriptive alt.</w:t>
+            </w:r>
+          </w:p>
+        </w:tc>
+      </w:tr>
+    </w:tbl>
+    <w:p>
+      <w:pPr>
+        <w:spacing w:after="120"/>
+      </w:pPr>
+    </w:p>
+    <w:p>
+      <w:pPr>
+        <w:spacing w:after="120"/>
+      </w:pPr>
+      <w:r>
+        <w:rPr>
+          <w:rFonts w:ascii="Arial" w:cs="Arial" w:eastAsia="Arial" w:hAnsi="Arial"/>
+          <w:b/>
+          <w:bCs/>
+          <w:sz w:val="20"/>
+          <w:szCs w:val="20"/>
+        </w:rPr>
+        <w:t xml:space="preserve">Deployed Structured Data (WebPage schema) — LIVE as of 2026-09-18</w:t>
+      </w:r>
+    </w:p>
+    <w:p>
+      <w:pPr>
+        <w:shd w:fill="F5F5F5" w:val="clear"/>
+        <w:spacing w:after="0"/>
+        <w:ind w:left="360"/>
+      </w:pPr>
+      <w:r>
+        <w:rPr>
+          <w:rFonts w:ascii="Courier New" w:cs="Courier New" w:eastAsia="Courier New" w:hAnsi="Courier New"/>
+          <w:sz w:val="16"/>
+          <w:szCs w:val="16"/>
+        </w:rPr>
+        <w:t xml:space="preserve">&lt;script type="application/ld+json"&gt;</w:t>
+      </w:r>
+    </w:p>
+    <w:p>
+      <w:pPr>
+        <w:shd w:fill="F5F5F5" w:val="clear"/>
+        <w:spacing w:after="0"/>
+        <w:ind w:left="360"/>
+      </w:pPr>
+      <w:r>
+        <w:rPr>
+          <w:rFonts w:ascii="Courier New" w:cs="Courier New" w:eastAsia="Courier New" w:hAnsi="Courier New"/>
+          <w:sz w:val="16"/>
+          <w:szCs w:val="16"/>
+        </w:rPr>
+        <w:t xml:space="preserve">{</w:t>
+      </w:r>
+    </w:p>
+    <w:p>
+      <w:pPr>
+        <w:shd w:fill="F5F5F5" w:val="clear"/>
+        <w:spacing w:after="0"/>
+        <w:ind w:left="360"/>
+      </w:pPr>
+      <w:r>
+        <w:rPr>
+          <w:rFonts w:ascii="Courier New" w:cs="Courier New" w:eastAsia="Courier New" w:hAnsi="Courier New"/>
+          <w:sz w:val="16"/>
+          <w:szCs w:val="16"/>
+        </w:rPr>
+        <w:t xml:space="preserve">  "@context": "https://schema.org",</w:t>
+      </w:r>
+    </w:p>
+    <w:p>
+      <w:pPr>
+        <w:shd w:fill="F5F5F5" w:val="clear"/>
+        <w:spacing w:after="0"/>
+        <w:ind w:left="360"/>
+      </w:pPr>
+      <w:r>
+        <w:rPr>
+          <w:rFonts w:ascii="Courier New" w:cs="Courier New" w:eastAsia="Courier New" w:hAnsi="Courier New"/>
+          <w:sz w:val="16"/>
+          <w:szCs w:val="16"/>
+        </w:rPr>
+        <w:t xml:space="preserve">  "@type": "WebPage",</w:t>
+      </w:r>
+    </w:p>
+    <w:p>
+      <w:pPr>
+        <w:shd w:fill="F5F5F5" w:val="clear"/>
+        <w:spacing w:after="0"/>
+        <w:ind w:left="360"/>
+      </w:pPr>
+      <w:r>
+        <w:rPr>
+          <w:rFonts w:ascii="Courier New" w:cs="Courier New" w:eastAsia="Courier New" w:hAnsi="Courier New"/>
+          <w:sz w:val="16"/>
+          <w:szCs w:val="16"/>
+        </w:rPr>
+        <w:t xml:space="preserve">  "name": "Cleanroom Packaging Standards &amp; Certifications",</w:t>
+      </w:r>
+    </w:p>
+    <w:p>
+      <w:pPr>
+        <w:shd w:fill="F5F5F5" w:val="clear"/>
+        <w:spacing w:after="0"/>
+        <w:ind w:left="360"/>
+      </w:pPr>
+      <w:r>
+        <w:rPr>
+          <w:rFonts w:ascii="Courier New" w:cs="Courier New" w:eastAsia="Courier New" w:hAnsi="Courier New"/>
+          <w:sz w:val="16"/>
+          <w:szCs w:val="16"/>
+        </w:rPr>
+        <w:t xml:space="preserve">  "description": "CFB cleanroom packaging meets ASTM, MIL-SPEC, USP &amp; ISO standards — ISO-certified Class 100 facility for medical, aerospace &amp; semiconductor compliance.",</w:t>
+      </w:r>
+    </w:p>
+    <w:p>
+      <w:pPr>
+        <w:shd w:fill="F5F5F5" w:val="clear"/>
+        <w:spacing w:after="0"/>
+        <w:ind w:left="360"/>
+      </w:pPr>
+      <w:r>
+        <w:rPr>
+          <w:rFonts w:ascii="Courier New" w:cs="Courier New" w:eastAsia="Courier New" w:hAnsi="Courier New"/>
+          <w:sz w:val="16"/>
+          <w:szCs w:val="16"/>
+        </w:rPr>
+        <w:t xml:space="preserve">  "url": "https://www.cleanroomfilm.com/standards",</w:t>
+      </w:r>
+    </w:p>
+    <w:p>
+      <w:pPr>
+        <w:shd w:fill="F5F5F5" w:val="clear"/>
+        <w:spacing w:after="0"/>
+        <w:ind w:left="360"/>
+      </w:pPr>
+      <w:r>
+        <w:rPr>
+          <w:rFonts w:ascii="Courier New" w:cs="Courier New" w:eastAsia="Courier New" w:hAnsi="Courier New"/>
+          <w:sz w:val="16"/>
+          <w:szCs w:val="16"/>
+        </w:rPr>
+        <w:t xml:space="preserve">  "publisher": {</w:t>
+      </w:r>
+    </w:p>
+    <w:p>
+      <w:pPr>
+        <w:shd w:fill="F5F5F5" w:val="clear"/>
+        <w:spacing w:after="0"/>
+        <w:ind w:left="360"/>
+      </w:pPr>
+      <w:r>
+        <w:rPr>
+          <w:rFonts w:ascii="Courier New" w:cs="Courier New" w:eastAsia="Courier New" w:hAnsi="Courier New"/>
+          <w:sz w:val="16"/>
+          <w:szCs w:val="16"/>
+        </w:rPr>
+        <w:t xml:space="preserve">    "@type": "Organization",</w:t>
+      </w:r>
+    </w:p>
+    <w:p>
+      <w:pPr>
+        <w:shd w:fill="F5F5F5" w:val="clear"/>
+        <w:spacing w:after="0"/>
+        <w:ind w:left="360"/>
+      </w:pPr>
+      <w:r>
+        <w:rPr>
+          <w:rFonts w:ascii="Courier New" w:cs="Courier New" w:eastAsia="Courier New" w:hAnsi="Courier New"/>
+          <w:sz w:val="16"/>
+          <w:szCs w:val="16"/>
+        </w:rPr>
+        <w:t xml:space="preserve">    "name": "Cleanroom Film &amp; Bags",</w:t>
+      </w:r>
+    </w:p>
+    <w:p>
+      <w:pPr>
+        <w:shd w:fill="F5F5F5" w:val="clear"/>
+        <w:spacing w:after="0"/>
+        <w:ind w:left="360"/>
+      </w:pPr>
+      <w:r>
+        <w:rPr>
+          <w:rFonts w:ascii="Courier New" w:cs="Courier New" w:eastAsia="Courier New" w:hAnsi="Courier New"/>
+          <w:sz w:val="16"/>
+          <w:szCs w:val="16"/>
+        </w:rPr>
+        <w:t xml:space="preserve">    "url": "https://www.cleanroomfilm.com"</w:t>
+      </w:r>
+    </w:p>
+    <w:p>
+      <w:pPr>
+        <w:shd w:fill="F5F5F5" w:val="clear"/>
+        <w:spacing w:after="0"/>
+        <w:ind w:left="360"/>
+      </w:pPr>
+      <w:r>
+        <w:rPr>
+          <w:rFonts w:ascii="Courier New" w:cs="Courier New" w:eastAsia="Courier New" w:hAnsi="Courier New"/>
+          <w:sz w:val="16"/>
+          <w:szCs w:val="16"/>
+        </w:rPr>
+        <w:t xml:space="preserve">  }</w:t>
+      </w:r>
+    </w:p>
+    <w:p>
+      <w:pPr>
+        <w:shd w:fill="F5F5F5" w:val="clear"/>
+        <w:spacing w:after="0"/>
+        <w:ind w:left="360"/>
+      </w:pPr>
+      <w:r>
+        <w:rPr>
+          <w:rFonts w:ascii="Courier New" w:cs="Courier New" w:eastAsia="Courier New" w:hAnsi="Courier New"/>
+          <w:sz w:val="16"/>
+          <w:szCs w:val="16"/>
+        </w:rPr>
+        <w:t xml:space="preserve">}</w:t>
+      </w:r>
+    </w:p>
+    <w:p>
+      <w:pPr>
+        <w:shd w:fill="F5F5F5" w:val="clear"/>
+        <w:spacing w:after="0"/>
+        <w:ind w:left="360"/>
+      </w:pPr>
+      <w:r>
+        <w:rPr>
+          <w:rFonts w:ascii="Courier New" w:cs="Courier New" w:eastAsia="Courier New" w:hAnsi="Courier New"/>
+          <w:sz w:val="16"/>
+          <w:szCs w:val="16"/>
+        </w:rPr>
+        <w:t xml:space="preserve">&lt;/script&gt;</w:t>
+      </w:r>
+    </w:p>
+    <w:p>
+      <w:pPr>
+        <w:spacing w:after="160"/>
+      </w:pPr>
+    </w:p>
+    <w:p>
+      <w:pPr>
+        <w:pStyle w:val="Heading1"/>
+        <w:spacing w:after="160" w:before="400"/>
+      </w:pPr>
+      <w:r>
+        <w:rPr>
+          <w:rFonts w:ascii="Arial" w:cs="Arial" w:eastAsia="Arial" w:hAnsi="Arial"/>
+          <w:b/>
+          <w:bCs/>
+          <w:color w:val="003366"/>
+          <w:sz w:val="30"/>
+          <w:szCs w:val="30"/>
+        </w:rPr>
+        <w:t xml:space="preserve">Contact Us</w:t>
+      </w:r>
+    </w:p>
+    <w:p>
+      <w:pPr>
+        <w:spacing w:after="120"/>
+      </w:pPr>
+      <w:r>
+        <w:rPr>
+          <w:rFonts w:ascii="Arial" w:cs="Arial" w:eastAsia="Arial" w:hAnsi="Arial"/>
+          <w:b/>
+          <w:bCs/>
+          <w:color w:val="2E7D32"/>
+          <w:sz w:val="20"/>
+          <w:szCs w:val="20"/>
+        </w:rPr>
+        <w:t xml:space="preserve">VERIFIED LIVE 2026-09-18 (title, meta, ContactPage schema)</w:t>
+      </w:r>
+    </w:p>
+    <w:p>
+      <w:pPr>
+        <w:spacing w:after="120"/>
+      </w:pPr>
+      <w:r>
+        <w:rPr>
+          <w:rFonts w:ascii="Arial" w:cs="Arial" w:eastAsia="Arial" w:hAnsi="Arial"/>
+          <w:b/>
+          <w:bCs/>
+          <w:sz w:val="20"/>
+          <w:szCs w:val="20"/>
+        </w:rPr>
+        <w:t xml:space="preserve">Live URL: </w:t>
+      </w:r>
+      <w:r>
+        <w:rPr>
+          <w:rFonts w:ascii="Arial" w:cs="Arial" w:eastAsia="Arial" w:hAnsi="Arial"/>
+          <w:color w:val="0563C1"/>
+          <w:sz w:val="20"/>
+          <w:szCs w:val="20"/>
+        </w:rPr>
+        <w:t xml:space="preserve">https://www.cleanroomfilm.com/contact-us</w:t>
+      </w:r>
+    </w:p>
+    <w:p>
+      <w:pPr>
+        <w:spacing w:after="120"/>
+      </w:pPr>
+      <w:r>
+        <w:rPr>
+          <w:rFonts w:ascii="Arial" w:cs="Arial" w:eastAsia="Arial" w:hAnsi="Arial"/>
+          <w:b/>
+          <w:bCs/>
+          <w:sz w:val="20"/>
+          <w:szCs w:val="20"/>
+        </w:rPr>
+        <w:t xml:space="preserve">HubSpot editor: </w:t>
+      </w:r>
+      <w:r>
+        <w:rPr>
+          <w:rFonts w:ascii="Arial" w:cs="Arial" w:eastAsia="Arial" w:hAnsi="Arial"/>
+          <w:color w:val="0563C1"/>
+          <w:sz w:val="20"/>
+          <w:szCs w:val="20"/>
+        </w:rPr>
+        <w:t xml:space="preserve">https://app.hubspot.com/pages/24024882/editor/ (add page ID from HubSpot)</w:t>
+      </w:r>
+    </w:p>
+    <w:p>
+      <w:pPr>
+        <w:spacing w:after="120"/>
+      </w:pPr>
+      <w:r>
+        <w:rPr>
+          <w:rFonts w:ascii="Arial" w:cs="Arial" w:eastAsia="Arial" w:hAnsi="Arial"/>
+          <w:b/>
+          <w:bCs/>
+          <w:sz w:val="20"/>
+          <w:szCs w:val="20"/>
+        </w:rPr>
+        <w:t xml:space="preserve">Audited: </w:t>
+      </w:r>
+      <w:r>
+        <w:rPr>
+          <w:rFonts w:ascii="Arial" w:cs="Arial" w:eastAsia="Arial" w:hAnsi="Arial"/>
+          <w:sz w:val="20"/>
+          <w:szCs w:val="20"/>
+        </w:rPr>
+        <w:t xml:space="preserve">2026-09-18      </w:t>
+      </w:r>
+      <w:r>
+        <w:rPr>
+          <w:rFonts w:ascii="Arial" w:cs="Arial" w:eastAsia="Arial" w:hAnsi="Arial"/>
+          <w:b/>
+          <w:bCs/>
+          <w:sz w:val="20"/>
+          <w:szCs w:val="20"/>
+        </w:rPr>
+        <w:t xml:space="preserve">Primary keyword: </w:t>
+      </w:r>
+      <w:r>
+        <w:rPr>
+          <w:rFonts w:ascii="Arial" w:cs="Arial" w:eastAsia="Arial" w:hAnsi="Arial"/>
+          <w:sz w:val="20"/>
+          <w:szCs w:val="20"/>
+        </w:rPr>
+        <w:t xml:space="preserve">contact cleanroom film bags</w:t>
+      </w:r>
+    </w:p>
+    <w:p>
+      <w:pPr>
+        <w:spacing w:after="120"/>
+      </w:pPr>
+      <w:r>
+        <w:rPr>
+          <w:rFonts w:ascii="Arial" w:cs="Arial" w:eastAsia="Arial" w:hAnsi="Arial"/>
+          <w:b/>
+          <w:bCs/>
+          <w:sz w:val="20"/>
+          <w:szCs w:val="20"/>
+        </w:rPr>
+        <w:t xml:space="preserve">Secondary keywords: </w:t>
+      </w:r>
+      <w:r>
+        <w:rPr>
+          <w:rFonts w:ascii="Arial" w:cs="Arial" w:eastAsia="Arial" w:hAnsi="Arial"/>
+          <w:sz w:val="20"/>
+          <w:szCs w:val="20"/>
+        </w:rPr>
+        <w:t xml:space="preserve">cleanroom packaging quote, CFB contact, Placentia CA cleanroom manufacturer</w:t>
+      </w:r>
+    </w:p>
+    <w:p>
+      <w:pPr>
+        <w:spacing w:after="120"/>
+      </w:pPr>
+      <w:r>
+        <w:rPr>
+          <w:rFonts w:ascii="Arial" w:cs="Arial" w:eastAsia="Arial" w:hAnsi="Arial"/>
+          <w:b/>
+          <w:bCs/>
+          <w:sz w:val="20"/>
+          <w:szCs w:val="20"/>
+        </w:rPr>
+        <w:t xml:space="preserve">Recommended Page Title (35 chars)</w:t>
+      </w:r>
+      <w:r>
+        <w:rPr>
+          <w:rFonts w:ascii="Arial" w:cs="Arial" w:eastAsia="Arial" w:hAnsi="Arial"/>
+          <w:sz w:val="20"/>
+          <w:szCs w:val="20"/>
+        </w:rPr>
+        <w:t xml:space="preserve"/>
+      </w:r>
+    </w:p>
+    <w:p>
+      <w:pPr>
+        <w:spacing w:after="120"/>
+      </w:pPr>
+      <w:r>
+        <w:rPr>
+          <w:rFonts w:ascii="Arial" w:cs="Arial" w:eastAsia="Arial" w:hAnsi="Arial"/>
+          <w:b/>
+          <w:bCs/>
+          <w:color w:val="003366"/>
+          <w:sz w:val="22"/>
+          <w:szCs w:val="22"/>
+        </w:rPr>
+        <w:t xml:space="preserve">Contact Cleanroom Film &amp; Bags | CFB</w:t>
+      </w:r>
+    </w:p>
+    <w:p>
+      <w:pPr>
+        <w:spacing w:after="120"/>
+      </w:pPr>
+      <w:r>
+        <w:rPr>
+          <w:rFonts w:ascii="Arial" w:cs="Arial" w:eastAsia="Arial" w:hAnsi="Arial"/>
+          <w:b/>
+          <w:bCs/>
+          <w:sz w:val="20"/>
+          <w:szCs w:val="20"/>
+        </w:rPr>
+        <w:t xml:space="preserve">Recommended Meta Description (150 chars)</w:t>
+      </w:r>
+      <w:r>
+        <w:rPr>
+          <w:rFonts w:ascii="Arial" w:cs="Arial" w:eastAsia="Arial" w:hAnsi="Arial"/>
+          <w:sz w:val="20"/>
+          <w:szCs w:val="20"/>
+        </w:rPr>
+        <w:t xml:space="preserve"/>
+      </w:r>
+    </w:p>
+    <w:p>
+      <w:pPr>
+        <w:spacing w:after="120"/>
+      </w:pPr>
+      <w:r>
+        <w:rPr>
+          <w:rFonts w:ascii="Arial" w:cs="Arial" w:eastAsia="Arial" w:hAnsi="Arial"/>
+          <w:color w:val="333333"/>
+          <w:sz w:val="22"/>
+          <w:szCs w:val="22"/>
+        </w:rPr>
+        <w:t xml:space="preserve">Request a quote from CFB — cleanroom film &amp; bags manufacturer in Placentia, CA, serving medical, pharmaceutical, semiconductor &amp; aerospace industries.</w:t>
+      </w:r>
+    </w:p>
+    <w:p>
+      <w:pPr>
+        <w:spacing w:after="120"/>
+      </w:pPr>
+      <w:r>
+        <w:rPr>
+          <w:rFonts w:ascii="Arial" w:cs="Arial" w:eastAsia="Arial" w:hAnsi="Arial"/>
+          <w:b/>
+          <w:bCs/>
+          <w:sz w:val="20"/>
+          <w:szCs w:val="20"/>
+        </w:rPr>
+        <w:t xml:space="preserve">Notes: </w:t>
+      </w:r>
+      <w:r>
+        <w:rPr>
+          <w:rFonts w:ascii="Arial" w:cs="Arial" w:eastAsia="Arial" w:hAnsi="Arial"/>
+          <w:sz w:val="20"/>
+          <w:szCs w:val="20"/>
+        </w:rPr>
+        <w:t xml:space="preserve">Title had wrong brand suffix ("Cleanroom Film &amp; Bags" without "CFB"). Meta started with "We are a custom plastic packaging company" — "plastic" not "cleanroom", no location, no industries named. No content images on page. ContactPage schema added with Organization mainEntity and Placentia, CA address.</w:t>
+      </w:r>
+    </w:p>
+    <w:p>
+      <w:pPr>
+        <w:spacing w:after="120"/>
+      </w:pPr>
+      <w:r>
+        <w:rPr>
+          <w:rFonts w:ascii="Arial" w:cs="Arial" w:eastAsia="Arial" w:hAnsi="Arial"/>
+          <w:b/>
+          <w:bCs/>
+          <w:sz w:val="20"/>
+          <w:szCs w:val="20"/>
+        </w:rPr>
+        <w:t xml:space="preserve">Deployed Structured Data (ContactPage schema) — LIVE as of 2026-09-18</w:t>
+      </w:r>
+    </w:p>
+    <w:p>
+      <w:pPr>
+        <w:shd w:fill="F5F5F5" w:val="clear"/>
+        <w:spacing w:after="0"/>
+        <w:ind w:left="360"/>
+      </w:pPr>
+      <w:r>
+        <w:rPr>
+          <w:rFonts w:ascii="Courier New" w:cs="Courier New" w:eastAsia="Courier New" w:hAnsi="Courier New"/>
+          <w:sz w:val="16"/>
+          <w:szCs w:val="16"/>
+        </w:rPr>
+        <w:t xml:space="preserve">&lt;script type="application/ld+json"&gt;</w:t>
+      </w:r>
+    </w:p>
+    <w:p>
+      <w:pPr>
+        <w:shd w:fill="F5F5F5" w:val="clear"/>
+        <w:spacing w:after="0"/>
+        <w:ind w:left="360"/>
+      </w:pPr>
+      <w:r>
+        <w:rPr>
+          <w:rFonts w:ascii="Courier New" w:cs="Courier New" w:eastAsia="Courier New" w:hAnsi="Courier New"/>
+          <w:sz w:val="16"/>
+          <w:szCs w:val="16"/>
+        </w:rPr>
+        <w:t xml:space="preserve">{</w:t>
+      </w:r>
+    </w:p>
+    <w:p>
+      <w:pPr>
+        <w:shd w:fill="F5F5F5" w:val="clear"/>
+        <w:spacing w:after="0"/>
+        <w:ind w:left="360"/>
+      </w:pPr>
+      <w:r>
+        <w:rPr>
+          <w:rFonts w:ascii="Courier New" w:cs="Courier New" w:eastAsia="Courier New" w:hAnsi="Courier New"/>
+          <w:sz w:val="16"/>
+          <w:szCs w:val="16"/>
+        </w:rPr>
+        <w:t xml:space="preserve">  "@context": "https://schema.org",</w:t>
+      </w:r>
+    </w:p>
+    <w:p>
+      <w:pPr>
+        <w:shd w:fill="F5F5F5" w:val="clear"/>
+        <w:spacing w:after="0"/>
+        <w:ind w:left="360"/>
+      </w:pPr>
+      <w:r>
+        <w:rPr>
+          <w:rFonts w:ascii="Courier New" w:cs="Courier New" w:eastAsia="Courier New" w:hAnsi="Courier New"/>
+          <w:sz w:val="16"/>
+          <w:szCs w:val="16"/>
+        </w:rPr>
+        <w:t xml:space="preserve">  "@type": "ContactPage",</w:t>
+      </w:r>
+    </w:p>
+    <w:p>
+      <w:pPr>
+        <w:shd w:fill="F5F5F5" w:val="clear"/>
+        <w:spacing w:after="0"/>
+        <w:ind w:left="360"/>
+      </w:pPr>
+      <w:r>
+        <w:rPr>
+          <w:rFonts w:ascii="Courier New" w:cs="Courier New" w:eastAsia="Courier New" w:hAnsi="Courier New"/>
+          <w:sz w:val="16"/>
+          <w:szCs w:val="16"/>
+        </w:rPr>
+        <w:t xml:space="preserve">  "name": "Contact Cleanroom Film &amp; Bags",</w:t>
+      </w:r>
+    </w:p>
+    <w:p>
+      <w:pPr>
+        <w:shd w:fill="F5F5F5" w:val="clear"/>
+        <w:spacing w:after="0"/>
+        <w:ind w:left="360"/>
+      </w:pPr>
+      <w:r>
+        <w:rPr>
+          <w:rFonts w:ascii="Courier New" w:cs="Courier New" w:eastAsia="Courier New" w:hAnsi="Courier New"/>
+          <w:sz w:val="16"/>
+          <w:szCs w:val="16"/>
+        </w:rPr>
+        <w:t xml:space="preserve">  "description": "Request a quote from CFB — cleanroom film &amp; bags manufacturer in Placentia, CA, serving medical, pharmaceutical, semiconductor &amp; aerospace industries.",</w:t>
+      </w:r>
+    </w:p>
+    <w:p>
+      <w:pPr>
+        <w:shd w:fill="F5F5F5" w:val="clear"/>
+        <w:spacing w:after="0"/>
+        <w:ind w:left="360"/>
+      </w:pPr>
+      <w:r>
+        <w:rPr>
+          <w:rFonts w:ascii="Courier New" w:cs="Courier New" w:eastAsia="Courier New" w:hAnsi="Courier New"/>
+          <w:sz w:val="16"/>
+          <w:szCs w:val="16"/>
+        </w:rPr>
+        <w:t xml:space="preserve">  "url": "https://www.cleanroomfilm.com/contact-us",</w:t>
+      </w:r>
+    </w:p>
+    <w:p>
+      <w:pPr>
+        <w:shd w:fill="F5F5F5" w:val="clear"/>
+        <w:spacing w:after="0"/>
+        <w:ind w:left="360"/>
+      </w:pPr>
+      <w:r>
+        <w:rPr>
+          <w:rFonts w:ascii="Courier New" w:cs="Courier New" w:eastAsia="Courier New" w:hAnsi="Courier New"/>
+          <w:sz w:val="16"/>
+          <w:szCs w:val="16"/>
+        </w:rPr>
+        <w:t xml:space="preserve">  "mainEntity": {</w:t>
+      </w:r>
+    </w:p>
+    <w:p>
+      <w:pPr>
+        <w:shd w:fill="F5F5F5" w:val="clear"/>
+        <w:spacing w:after="0"/>
+        <w:ind w:left="360"/>
+      </w:pPr>
+      <w:r>
+        <w:rPr>
+          <w:rFonts w:ascii="Courier New" w:cs="Courier New" w:eastAsia="Courier New" w:hAnsi="Courier New"/>
+          <w:sz w:val="16"/>
+          <w:szCs w:val="16"/>
+        </w:rPr>
+        <w:t xml:space="preserve">    "@type": "Organization",</w:t>
+      </w:r>
+    </w:p>
+    <w:p>
+      <w:pPr>
+        <w:shd w:fill="F5F5F5" w:val="clear"/>
+        <w:spacing w:after="0"/>
+        <w:ind w:left="360"/>
+      </w:pPr>
+      <w:r>
+        <w:rPr>
+          <w:rFonts w:ascii="Courier New" w:cs="Courier New" w:eastAsia="Courier New" w:hAnsi="Courier New"/>
+          <w:sz w:val="16"/>
+          <w:szCs w:val="16"/>
+        </w:rPr>
+        <w:t xml:space="preserve">    "name": "Cleanroom Film &amp; Bags",</w:t>
+      </w:r>
+    </w:p>
+    <w:p>
+      <w:pPr>
+        <w:shd w:fill="F5F5F5" w:val="clear"/>
+        <w:spacing w:after="0"/>
+        <w:ind w:left="360"/>
+      </w:pPr>
+      <w:r>
+        <w:rPr>
+          <w:rFonts w:ascii="Courier New" w:cs="Courier New" w:eastAsia="Courier New" w:hAnsi="Courier New"/>
+          <w:sz w:val="16"/>
+          <w:szCs w:val="16"/>
+        </w:rPr>
+        <w:t xml:space="preserve">    "url": "https://www.cleanroomfilm.com",</w:t>
+      </w:r>
+    </w:p>
+    <w:p>
+      <w:pPr>
+        <w:shd w:fill="F5F5F5" w:val="clear"/>
+        <w:spacing w:after="0"/>
+        <w:ind w:left="360"/>
+      </w:pPr>
+      <w:r>
+        <w:rPr>
+          <w:rFonts w:ascii="Courier New" w:cs="Courier New" w:eastAsia="Courier New" w:hAnsi="Courier New"/>
+          <w:sz w:val="16"/>
+          <w:szCs w:val="16"/>
+        </w:rPr>
+        <w:t xml:space="preserve">    "address": {</w:t>
+      </w:r>
+    </w:p>
+    <w:p>
+      <w:pPr>
+        <w:shd w:fill="F5F5F5" w:val="clear"/>
+        <w:spacing w:after="0"/>
+        <w:ind w:left="360"/>
+      </w:pPr>
+      <w:r>
+        <w:rPr>
+          <w:rFonts w:ascii="Courier New" w:cs="Courier New" w:eastAsia="Courier New" w:hAnsi="Courier New"/>
+          <w:sz w:val="16"/>
+          <w:szCs w:val="16"/>
+        </w:rPr>
+        <w:t xml:space="preserve">      "@type": "PostalAddress",</w:t>
+      </w:r>
+    </w:p>
+    <w:p>
+      <w:pPr>
+        <w:shd w:fill="F5F5F5" w:val="clear"/>
+        <w:spacing w:after="0"/>
+        <w:ind w:left="360"/>
+      </w:pPr>
+      <w:r>
+        <w:rPr>
+          <w:rFonts w:ascii="Courier New" w:cs="Courier New" w:eastAsia="Courier New" w:hAnsi="Courier New"/>
+          <w:sz w:val="16"/>
+          <w:szCs w:val="16"/>
+        </w:rPr>
+        <w:t xml:space="preserve">      "addressLocality": "Placentia",</w:t>
+      </w:r>
+    </w:p>
+    <w:p>
+      <w:pPr>
+        <w:shd w:fill="F5F5F5" w:val="clear"/>
+        <w:spacing w:after="0"/>
+        <w:ind w:left="360"/>
+      </w:pPr>
+      <w:r>
+        <w:rPr>
+          <w:rFonts w:ascii="Courier New" w:cs="Courier New" w:eastAsia="Courier New" w:hAnsi="Courier New"/>
+          <w:sz w:val="16"/>
+          <w:szCs w:val="16"/>
+        </w:rPr>
+        <w:t xml:space="preserve">      "addressRegion": "CA",</w:t>
+      </w:r>
+    </w:p>
+    <w:p>
+      <w:pPr>
+        <w:shd w:fill="F5F5F5" w:val="clear"/>
+        <w:spacing w:after="0"/>
+        <w:ind w:left="360"/>
+      </w:pPr>
+      <w:r>
+        <w:rPr>
+          <w:rFonts w:ascii="Courier New" w:cs="Courier New" w:eastAsia="Courier New" w:hAnsi="Courier New"/>
+          <w:sz w:val="16"/>
+          <w:szCs w:val="16"/>
+        </w:rPr>
+        <w:t xml:space="preserve">      "addressCountry": "US"</w:t>
+      </w:r>
+    </w:p>
+    <w:p>
+      <w:pPr>
+        <w:shd w:fill="F5F5F5" w:val="clear"/>
+        <w:spacing w:after="0"/>
+        <w:ind w:left="360"/>
+      </w:pPr>
+      <w:r>
+        <w:rPr>
+          <w:rFonts w:ascii="Courier New" w:cs="Courier New" w:eastAsia="Courier New" w:hAnsi="Courier New"/>
+          <w:sz w:val="16"/>
+          <w:szCs w:val="16"/>
+        </w:rPr>
+        <w:t xml:space="preserve">    }</w:t>
+      </w:r>
+    </w:p>
+    <w:p>
+      <w:pPr>
+        <w:shd w:fill="F5F5F5" w:val="clear"/>
+        <w:spacing w:after="0"/>
+        <w:ind w:left="360"/>
+      </w:pPr>
+      <w:r>
+        <w:rPr>
+          <w:rFonts w:ascii="Courier New" w:cs="Courier New" w:eastAsia="Courier New" w:hAnsi="Courier New"/>
+          <w:sz w:val="16"/>
+          <w:szCs w:val="16"/>
+        </w:rPr>
+        <w:t xml:space="preserve">  }</w:t>
       </w:r>
     </w:p>
     <w:p>

</xml_diff>